<commit_message>
Rebuild Ch10 Backlash and Broken Promises worksheets: add student work + teacher answer keys
Co-Authored-By: Claude Opus 4.8 <noreply@anthropic.com>
Claude-Session: https://claude.ai/code/session_015FDXZfxhU1Z58uEGaySNHv
</commit_message>
<xml_diff>
--- a/Part-Two-Ch10-Backlash-and-Broken-Promises/Convict Leasing.docx
+++ b/Part-Two-Ch10-Backlash-and-Broken-Promises/Convict Leasing.docx
@@ -9,25 +9,22 @@
         <w:tblLook w:firstColumn="1" w:firstRow="1" w:lastColumn="0" w:lastRow="0" w:noHBand="0" w:noVBand="1" w:val="04A0"/>
       </w:tblPr>
       <w:tblGrid>
-        <w:gridCol w:w="9936"/>
+        <w:gridCol w:w="10224"/>
       </w:tblGrid>
       <w:tr>
         <w:tc>
           <w:tcPr>
-            <w:tcW w:type="dxa" w:w="9936"/>
+            <w:tcW w:type="dxa" w:w="10224"/>
             <w:shd w:val="clear" w:fill="B1442F"/>
           </w:tcPr>
           <w:p>
-            <w:pPr>
-              <w:jc w:val="left"/>
-            </w:pPr>
             <w:r>
               <w:rPr>
                 <w:b/>
                 <w:color w:val="FFE6DE"/>
                 <w:sz w:val="18"/>
               </w:rPr>
-              <w:t>CHAPTER 10 · DEEP DIVE · A HOUSE DIVIDED</w:t>
+              <w:t>PROMISE &amp; PRACTICE  ·  DEEP DIVE  ·  SOURCE ANALYSIS</w:t>
             </w:r>
           </w:p>
           <w:p>
@@ -35,18 +32,19 @@
               <w:rPr>
                 <w:b/>
                 <w:color w:val="FFFFFF"/>
-                <w:sz w:val="40"/>
+                <w:sz w:val="42"/>
               </w:rPr>
-              <w:t>Convict Leasing</w:t>
+              <w:t>Convict Leasing — A House Divided</w:t>
             </w:r>
           </w:p>
           <w:p>
             <w:r>
               <w:rPr>
+                <w:i/>
                 <w:color w:val="FFE6DE"/>
-                <w:sz w:val="21"/>
+                <w:sz w:val="22"/>
               </w:rPr>
-              <w:t>How a loophole in the amendment that ended slavery was used to force thousands of Black Americans back into unpaid, brutal labor. 1870s–1920s.</w:t>
+              <w:t>Slavery by Another Name</w:t>
             </w:r>
           </w:p>
         </w:tc>
@@ -64,7 +62,7 @@
         <w:rPr>
           <w:sz w:val="21"/>
         </w:rPr>
-        <w:t xml:space="preserve">__________________________    </w:t>
+        <w:t xml:space="preserve">______________________________    </w:t>
       </w:r>
       <w:r>
         <w:rPr>
@@ -90,30 +88,177 @@
         <w:rPr>
           <w:sz w:val="21"/>
         </w:rPr>
-        <w:t>______________</w:t>
+        <w:t>________________</w:t>
+      </w:r>
+    </w:p>
+    <w:tbl>
+      <w:tblPr>
+        <w:tblW w:type="auto" w:w="0"/>
+        <w:tblLayout w:type="autofit"/>
+        <w:tblLook w:firstColumn="1" w:firstRow="1" w:lastColumn="0" w:lastRow="0" w:noHBand="0" w:noVBand="1" w:val="04A0"/>
+      </w:tblPr>
+      <w:tblGrid>
+        <w:gridCol w:w="10224"/>
+      </w:tblGrid>
+      <w:tr>
+        <w:tc>
+          <w:tcPr>
+            <w:tcW w:type="dxa" w:w="10224"/>
+            <w:shd w:val="clear" w:fill="f4c04e"/>
+          </w:tcPr>
+          <w:p>
+            <w:r>
+              <w:rPr>
+                <w:b/>
+                <w:color w:val="5A4512"/>
+                <w:sz w:val="19"/>
+              </w:rPr>
+              <w:t xml:space="preserve">WHAT I CAN DO TODAY   </w:t>
+            </w:r>
+            <w:r>
+              <w:rPr>
+                <w:color w:val="5A4512"/>
+                <w:sz w:val="21"/>
+              </w:rPr>
+              <w:t>I can read primary sources about Convict Leasing — A House Divided, weigh who made each one and why, and use evidence to answer historical questions.</w:t>
+            </w:r>
+          </w:p>
+        </w:tc>
+      </w:tr>
+    </w:tbl>
+    <w:p>
+      <w:r>
+        <w:rPr>
+          <w:b/>
+          <w:color w:val="B1442F"/>
+        </w:rPr>
+        <w:t xml:space="preserve">Directions. </w:t>
+      </w:r>
+      <w:r>
+        <w:rPr>
+          <w:sz w:val="22"/>
+        </w:rPr>
+        <w:t>The best historians connect threads. See how one clause ties this whole unit together</w:t>
       </w:r>
     </w:p>
     <w:p/>
     <w:p>
       <w:r>
         <w:rPr>
+          <w:b/>
+          <w:color w:val="B1442F"/>
+          <w:sz w:val="26"/>
+        </w:rPr>
+        <w:t>THE SOURCES</w:t>
+      </w:r>
+    </w:p>
+    <w:p>
+      <w:pPr>
+        <w:spacing w:before="160"/>
+      </w:pPr>
+      <w:r>
+        <w:rPr>
+          <w:b/>
+          <w:color w:val="1C1714"/>
+          <w:sz w:val="23"/>
+        </w:rPr>
+        <w:t>SOURCE · THE CLAUSE AND THE SYSTEM  —  From eleven words to a system</w:t>
+      </w:r>
+    </w:p>
+    <w:p>
+      <w:pPr>
+        <w:ind w:left="432"/>
+      </w:pPr>
+      <w:r>
+        <w:rPr>
           <w:i/>
           <w:color w:val="1C1714"/>
           <w:sz w:val="22"/>
         </w:rPr>
-        <w:t>How a loophole in the amendment that ended slavery was used to force thousands of Black Americans back into unpaid, brutal labor. 1870s–1920s.</w:t>
+        <w:t>13th Amendment: “Neither slavery nor involuntary servitude, except as a punishment for crime whereof the party shall have been duly convicted …” Convict leasing: states used vague laws (vagrancy, loitering) to convict Black Southerners, then leased them to companies for unpaid labor in mines, fields, and railroads — often under conditions deadlier than slavery.</w:t>
+        <w:br/>
+        <w:t>— summarized from the historical record. Public domain</w:t>
+      </w:r>
+    </w:p>
+    <w:p>
+      <w:r>
+        <w:rPr>
+          <w:color w:val="6A6256"/>
+          <w:sz w:val="17"/>
+        </w:rPr>
+        <w:t>— summarized from the historical record. Public domain.</w:t>
       </w:r>
     </w:p>
     <w:p>
       <w:pPr>
-        <w:spacing w:after="80"/>
+        <w:spacing w:before="160"/>
       </w:pPr>
       <w:r>
         <w:rPr>
+          <w:b/>
           <w:color w:val="1C1714"/>
           <w:sz w:val="23"/>
         </w:rPr>
-        <w:t>If the Constitution abolished slavery ‘except as a punishment for crime,’ what happens when a state decides to call freedom a crime?</w:t>
+        <w:t>THE IMAGE  —  A convict labor gang</w:t>
+      </w:r>
+    </w:p>
+    <w:p>
+      <w:pPr>
+        <w:jc w:val="center"/>
+      </w:pPr>
+      <w:r>
+        <w:drawing>
+          <wp:inline xmlns:a="http://schemas.openxmlformats.org/drawingml/2006/main" xmlns:pic="http://schemas.openxmlformats.org/drawingml/2006/picture">
+            <wp:extent cx="3931920" cy="3102531"/>
+            <wp:docPr id="1" name="Picture 1"/>
+            <wp:cNvGraphicFramePr>
+              <a:graphicFrameLocks noChangeAspect="1"/>
+            </wp:cNvGraphicFramePr>
+            <a:graphic>
+              <a:graphicData uri="http://schemas.openxmlformats.org/drawingml/2006/picture">
+                <pic:pic>
+                  <pic:nvPicPr>
+                    <pic:cNvPr id="0" name="image.jpg"/>
+                    <pic:cNvPicPr/>
+                  </pic:nvPicPr>
+                  <pic:blipFill>
+                    <a:blip r:embed="rId9"/>
+                    <a:stretch>
+                      <a:fillRect/>
+                    </a:stretch>
+                  </pic:blipFill>
+                  <pic:spPr>
+                    <a:xfrm>
+                      <a:off x="0" y="0"/>
+                      <a:ext cx="3931920" cy="3102531"/>
+                    </a:xfrm>
+                    <a:prstGeom prst="rect"/>
+                  </pic:spPr>
+                </pic:pic>
+              </a:graphicData>
+            </a:graphic>
+          </wp:inline>
+        </w:drawing>
+      </w:r>
+    </w:p>
+    <w:p>
+      <w:r>
+        <w:rPr>
+          <w:color w:val="6A6256"/>
+          <w:sz w:val="17"/>
+        </w:rPr>
+        <w:t>Convict laborers on a Southern farm — photograph, early 20th century, public domain (Library of Congress).</w:t>
+      </w:r>
+    </w:p>
+    <w:p/>
+    <w:p>
+      <w:r>
+        <w:rPr>
+          <w:b/>
+          <w:color w:val="B1442F"/>
+          <w:sz w:val="26"/>
+        </w:rPr>
+        <w:t>YOUR WORK</w:t>
       </w:r>
     </w:p>
     <w:p>
@@ -123,44 +268,65 @@
       <w:r>
         <w:rPr>
           <w:b/>
-          <w:color w:val="B1442F"/>
-          <w:sz w:val="28"/>
+          <w:color w:val="FFFFFF"/>
+          <w:sz w:val="20"/>
+          <w:shd w:val="clear" w:fill="B1442F"/>
         </w:rPr>
-        <w:t>Eleven Words</w:t>
+        <w:t xml:space="preserve">  QUESTION 1  </w:t>
+      </w:r>
+      <w:r>
+        <w:rPr>
+          <w:b/>
+          <w:color w:val="6A6256"/>
+          <w:sz w:val="18"/>
+        </w:rPr>
+        <w:t xml:space="preserve">   STEP 1 · THE LOOPHOLE</w:t>
       </w:r>
     </w:p>
     <w:p>
       <w:r>
         <w:rPr>
-          <w:b/>
-          <w:color w:val="6A6256"/>
-          <w:sz w:val="17"/>
+          <w:b w:val="0"/>
+          <w:color w:val="1C1714"/>
+          <w:sz w:val="23"/>
         </w:rPr>
-        <w:t>THE LOOPHOLE, REMEMBERED</w:t>
+        <w:t>Explain how the exact wording of the 13th Amendment made convict leasing possible. Which eleven words were the key?</w:t>
       </w:r>
     </w:p>
     <w:p>
       <w:pPr>
-        <w:spacing w:after="80"/>
+        <w:spacing w:after="120"/>
       </w:pPr>
       <w:r>
         <w:rPr>
-          <w:color w:val="1C1714"/>
-          <w:sz w:val="23"/>
+          <w:color w:val="9A9286"/>
+          <w:sz w:val="22"/>
         </w:rPr>
-        <w:t>Look again at the Thirteenth Amendment: slavery is abolished “except as a punishment for crime whereof the party shall have been duly convicted.” Those eleven words were a door left open — and the Redeemer governments walked right through it.</w:t>
+        <w:t>____________________________________________________________________________________________</w:t>
       </w:r>
     </w:p>
     <w:p>
       <w:pPr>
-        <w:spacing w:after="80"/>
+        <w:spacing w:after="120"/>
       </w:pPr>
       <w:r>
         <w:rPr>
-          <w:color w:val="1C1714"/>
-          <w:sz w:val="23"/>
+          <w:color w:val="9A9286"/>
+          <w:sz w:val="22"/>
         </w:rPr>
-        <w:t>If a person could be convicted of a crime, the state could legally force them to labor without pay. So the system found ways to convict Black Southerners — in enormous numbers.</w:t>
+        <w:t>____________________________________________________________________________________________</w:t>
+      </w:r>
+    </w:p>
+    <w:p>
+      <w:pPr>
+        <w:spacing w:after="120"/>
+      </w:pPr>
+      <w:r>
+        <w:rPr>
+          <w:color w:val="9A9286"/>
+          <w:sz w:val="22"/>
+        </w:rPr>
+        <w:t>____________________________________________________________________________________________</w:t>
       </w:r>
     </w:p>
     <w:p>
@@ -170,54 +336,77 @@
       <w:r>
         <w:rPr>
           <w:b/>
-          <w:color w:val="B1442F"/>
-          <w:sz w:val="28"/>
+          <w:color w:val="FFFFFF"/>
+          <w:sz w:val="20"/>
+          <w:shd w:val="clear" w:fill="B1442F"/>
         </w:rPr>
-        <w:t>Arrest, Convict, Lease</w:t>
+        <w:t xml:space="preserve">  QUESTION 2  </w:t>
+      </w:r>
+      <w:r>
+        <w:rPr>
+          <w:b/>
+          <w:color w:val="6A6256"/>
+          <w:sz w:val="18"/>
+        </w:rPr>
+        <w:t xml:space="preserve">   STEP 2 · THE MACHINERY</w:t>
       </w:r>
     </w:p>
     <w:p>
       <w:r>
         <w:rPr>
-          <w:b/>
-          <w:color w:val="6A6256"/>
-          <w:sz w:val="17"/>
+          <w:b w:val="0"/>
+          <w:color w:val="1C1714"/>
+          <w:sz w:val="23"/>
         </w:rPr>
-        <w:t>HOW IT WORKED</w:t>
+        <w:t>How did states produce the convicts whose labor they leased out?</w:t>
       </w:r>
     </w:p>
     <w:p>
       <w:pPr>
-        <w:spacing w:after="80"/>
+        <w:spacing w:after="40"/>
+        <w:ind w:left="432"/>
       </w:pPr>
       <w:r>
         <w:rPr>
-          <w:color w:val="1C1714"/>
-          <w:sz w:val="23"/>
+          <w:sz w:val="22"/>
         </w:rPr>
-        <w:t>Southern states passed broad, vague laws — vagrancy, loitering, “insulting gestures” — that could be used to arrest almost any Black person at will. Those convicted were then leased out by the state to plantations, mines, railroads, and factories, which paid the state for their labor.</w:t>
+        <w:t>☐  A.  they asked for volunteers</w:t>
       </w:r>
     </w:p>
     <w:p>
       <w:pPr>
-        <w:spacing w:after="80"/>
+        <w:spacing w:after="40"/>
+        <w:ind w:left="432"/>
       </w:pPr>
       <w:r>
         <w:rPr>
-          <w:color w:val="1C1714"/>
-          <w:sz w:val="23"/>
+          <w:sz w:val="22"/>
         </w:rPr>
-        <w:t>The companies had no reason to keep the workers alive — if one died, the state simply supplied another. Conditions were often deadlier than slavery had been.</w:t>
+        <w:t>☐  B.  they used broad, vague laws (like vagrancy) to arrest and convict people at will</w:t>
       </w:r>
     </w:p>
     <w:p>
+      <w:pPr>
+        <w:spacing w:after="40"/>
+        <w:ind w:left="432"/>
+      </w:pPr>
       <w:r>
         <w:rPr>
-          <w:i/>
-          <w:color w:val="6A6256"/>
-          <w:sz w:val="17"/>
+          <w:sz w:val="22"/>
         </w:rPr>
-        <w:t>Redemption, 1869–77 — map, © ShadowDog Digital Studios (SDS Digital Collection).</w:t>
+        <w:t>☐  C.  they only arrested violent criminals</w:t>
+      </w:r>
+    </w:p>
+    <w:p>
+      <w:pPr>
+        <w:spacing w:after="40"/>
+        <w:ind w:left="432"/>
+      </w:pPr>
+      <w:r>
+        <w:rPr>
+          <w:sz w:val="22"/>
+        </w:rPr>
+        <w:t>☐  D.  they freed all prisoners</w:t>
       </w:r>
     </w:p>
     <w:p>
@@ -227,40 +416,77 @@
       <w:r>
         <w:rPr>
           <w:b/>
-          <w:color w:val="B1442F"/>
-          <w:sz w:val="28"/>
+          <w:color w:val="FFFFFF"/>
+          <w:sz w:val="20"/>
+          <w:shd w:val="clear" w:fill="B1442F"/>
         </w:rPr>
-        <w:t>Bound Again</w:t>
+        <w:t xml:space="preserve">  QUESTION 3  </w:t>
+      </w:r>
+      <w:r>
+        <w:rPr>
+          <w:b/>
+          <w:color w:val="6A6256"/>
+          <w:sz w:val="18"/>
+        </w:rPr>
+        <w:t xml:space="preserve">   STEP 3 · CONNECT THE UNIT</w:t>
       </w:r>
     </w:p>
     <w:p>
       <w:r>
         <w:rPr>
-          <w:b/>
-          <w:color w:val="6A6256"/>
-          <w:sz w:val="17"/>
+          <w:b w:val="0"/>
+          <w:color w:val="1C1714"/>
+          <w:sz w:val="23"/>
         </w:rPr>
-        <w:t>THE CONVICT-LEASE SOUTH</w:t>
+        <w:t>Convict leasing links to the 13th Amendment, to the Redeemer governments, and even to the prison-farm recordings in “Songs of the Enslaved.” In your own words, explain how these threads connect.</w:t>
       </w:r>
     </w:p>
     <w:p>
+      <w:pPr>
+        <w:spacing w:after="120"/>
+      </w:pPr>
       <w:r>
         <w:rPr>
-          <w:i/>
-          <w:color w:val="1C1714"/>
+          <w:color w:val="9A9286"/>
           <w:sz w:val="22"/>
         </w:rPr>
-        <w:t>Chained work gangs of mostly Black prisoners labored in mines, forests, and fields across the South — a brutal system that enriched states and companies on unpaid, coerced labor.</w:t>
+        <w:t>____________________________________________________________________________________________</w:t>
       </w:r>
     </w:p>
     <w:p>
+      <w:pPr>
+        <w:spacing w:after="120"/>
+      </w:pPr>
       <w:r>
         <w:rPr>
-          <w:i/>
-          <w:color w:val="6A6256"/>
-          <w:sz w:val="17"/>
+          <w:color w:val="9A9286"/>
+          <w:sz w:val="22"/>
         </w:rPr>
-        <w:t>Convict laborers on a Southern farm — photograph, early 20th century, public domain (Library of Congress).</w:t>
+        <w:t>____________________________________________________________________________________________</w:t>
+      </w:r>
+    </w:p>
+    <w:p>
+      <w:pPr>
+        <w:spacing w:after="120"/>
+      </w:pPr>
+      <w:r>
+        <w:rPr>
+          <w:color w:val="9A9286"/>
+          <w:sz w:val="22"/>
+        </w:rPr>
+        <w:t>____________________________________________________________________________________________</w:t>
+      </w:r>
+    </w:p>
+    <w:p>
+      <w:pPr>
+        <w:spacing w:after="120"/>
+      </w:pPr>
+      <w:r>
+        <w:rPr>
+          <w:color w:val="9A9286"/>
+          <w:sz w:val="22"/>
+        </w:rPr>
+        <w:t>____________________________________________________________________________________________</w:t>
       </w:r>
     </w:p>
     <w:p>
@@ -270,80 +496,91 @@
       <w:r>
         <w:rPr>
           <w:b/>
-          <w:color w:val="B1442F"/>
-          <w:sz w:val="28"/>
+          <w:color w:val="FFFFFF"/>
+          <w:sz w:val="20"/>
+          <w:shd w:val="clear" w:fill="B1442F"/>
         </w:rPr>
-        <w:t>Slavery's Afterlife</w:t>
+        <w:t xml:space="preserve">  QUESTION 4  </w:t>
+      </w:r>
+      <w:r>
+        <w:rPr>
+          <w:b/>
+          <w:color w:val="6A6256"/>
+          <w:sz w:val="18"/>
+        </w:rPr>
+        <w:t xml:space="preserve">   STEP 4 · WHY IT MATTERS</w:t>
       </w:r>
     </w:p>
     <w:p>
       <w:r>
         <w:rPr>
-          <w:b/>
-          <w:color w:val="6A6256"/>
-          <w:sz w:val="17"/>
+          <w:b w:val="0"/>
+          <w:color w:val="1C1714"/>
+          <w:sz w:val="23"/>
         </w:rPr>
-        <w:t>MAKING CONNECTIONS</w:t>
+        <w:t>A historian called convict leasing “slavery by another name.” In three or four sentences, explain whether you think that phrase is fair — and what this history teaches about how hard-won freedom can be undermined.</w:t>
       </w:r>
     </w:p>
     <w:p>
       <w:pPr>
-        <w:spacing w:after="80"/>
+        <w:spacing w:after="120"/>
       </w:pPr>
       <w:r>
         <w:rPr>
-          <w:color w:val="1C1714"/>
-          <w:sz w:val="23"/>
+          <w:color w:val="9A9286"/>
+          <w:sz w:val="22"/>
         </w:rPr>
-        <w:t>Convict leasing connects the threads of this whole unit. It grew directly from the Thirteenth Amendment's loophole; it was enforced by the Redeemer governments that ended Reconstruction; and its victims' voices survive in the work songs and field recordings of Southern prison farms — the subject of our “Songs of the Enslaved” lesson, whose 1939 recordings come from exactly this system.</w:t>
+        <w:t>____________________________________________________________________________________________</w:t>
       </w:r>
     </w:p>
     <w:p>
       <w:pPr>
-        <w:spacing w:after="80"/>
+        <w:spacing w:after="120"/>
       </w:pPr>
       <w:r>
         <w:rPr>
-          <w:color w:val="1C1714"/>
-          <w:sz w:val="23"/>
+          <w:color w:val="9A9286"/>
+          <w:sz w:val="22"/>
         </w:rPr>
-        <w:t>It reminds us that the end of slavery in 1865 was not the end of the struggle over freedom — a struggle whose echoes reach into our own time, in debates about criminal justice and equality today.</w:t>
+        <w:t>____________________________________________________________________________________________</w:t>
       </w:r>
     </w:p>
     <w:p>
       <w:pPr>
-        <w:spacing w:before="200"/>
+        <w:spacing w:after="120"/>
       </w:pPr>
       <w:r>
         <w:rPr>
-          <w:b/>
-          <w:color w:val="B1442F"/>
-          <w:sz w:val="28"/>
+          <w:color w:val="9A9286"/>
+          <w:sz w:val="22"/>
         </w:rPr>
-        <w:t>Connect the Threads</w:t>
+        <w:t>____________________________________________________________________________________________</w:t>
       </w:r>
     </w:p>
     <w:p>
+      <w:pPr>
+        <w:spacing w:after="120"/>
+      </w:pPr>
       <w:r>
         <w:rPr>
-          <w:b/>
-          <w:color w:val="6A6256"/>
-          <w:sz w:val="17"/>
+          <w:color w:val="9A9286"/>
+          <w:sz w:val="22"/>
         </w:rPr>
-        <w:t>YOUR TURN</w:t>
+        <w:t>____________________________________________________________________________________________</w:t>
       </w:r>
     </w:p>
     <w:p>
+      <w:pPr>
+        <w:spacing w:after="120"/>
+      </w:pPr>
       <w:r>
         <w:rPr>
-          <w:i/>
-          <w:color w:val="1C1714"/>
+          <w:color w:val="9A9286"/>
           <w:sz w:val="22"/>
         </w:rPr>
-        <w:t>You'll trace how a single clause links the 13th Amendment, Redemption, and even the music of the enslaved — practicing the skill of making connections across history.</w:t>
+        <w:t>____________________________________________________________________________________________</w:t>
       </w:r>
     </w:p>
-    <w:p/>
     <w:p>
       <w:pPr>
         <w:jc w:val="center"/>
@@ -356,9 +593,160 @@
         <w:t>Promise &amp; Practice · ShadowDog Digital Studios · Unit 2</w:t>
       </w:r>
     </w:p>
+    <w:p>
+      <w:r>
+        <w:br w:type="page"/>
+      </w:r>
+    </w:p>
+    <w:tbl>
+      <w:tblPr>
+        <w:tblW w:type="auto" w:w="0"/>
+        <w:tblLayout w:type="autofit"/>
+        <w:tblLook w:firstColumn="1" w:firstRow="1" w:lastColumn="0" w:lastRow="0" w:noHBand="0" w:noVBand="1" w:val="04A0"/>
+      </w:tblPr>
+      <w:tblGrid>
+        <w:gridCol w:w="10224"/>
+      </w:tblGrid>
+      <w:tr>
+        <w:tc>
+          <w:tcPr>
+            <w:tcW w:type="dxa" w:w="10224"/>
+            <w:shd w:val="clear" w:fill="2c2219"/>
+          </w:tcPr>
+          <w:p>
+            <w:r>
+              <w:rPr>
+                <w:b/>
+                <w:color w:val="F0A184"/>
+                <w:sz w:val="28"/>
+              </w:rPr>
+              <w:t>TEACHER ANSWER KEY  —  Convict Leasing — A House Divided</w:t>
+            </w:r>
+          </w:p>
+        </w:tc>
+      </w:tr>
+    </w:tbl>
+    <w:p/>
+    <w:p>
+      <w:r>
+        <w:rPr>
+          <w:b/>
+          <w:color w:val="B1442F"/>
+          <w:sz w:val="22"/>
+        </w:rPr>
+        <w:t xml:space="preserve">QUESTION 1:  </w:t>
+      </w:r>
+      <w:r>
+        <w:rPr>
+          <w:sz w:val="22"/>
+        </w:rPr>
+        <w:t>Open response.</w:t>
+      </w:r>
+    </w:p>
+    <w:p>
+      <w:pPr>
+        <w:ind w:left="432"/>
+      </w:pPr>
+      <w:r>
+        <w:rPr>
+          <w:i/>
+          <w:color w:val="6A6256"/>
+          <w:sz w:val="21"/>
+        </w:rPr>
+        <w:t>Look for a response along the lines of: “The 13th Amendment banned slavery except…, so states could…”</w:t>
+      </w:r>
+    </w:p>
+    <w:p>
+      <w:r>
+        <w:rPr>
+          <w:b/>
+          <w:color w:val="B1442F"/>
+          <w:sz w:val="22"/>
+        </w:rPr>
+        <w:t xml:space="preserve">QUESTION 2:  </w:t>
+      </w:r>
+      <w:r>
+        <w:rPr>
+          <w:b/>
+          <w:sz w:val="22"/>
+        </w:rPr>
+        <w:t>Correct — B. they used broad, vague laws (like vagrancy) to arrest and convict people at will</w:t>
+      </w:r>
+    </w:p>
+    <w:p>
+      <w:pPr>
+        <w:ind w:left="432"/>
+      </w:pPr>
+      <w:r>
+        <w:rPr>
+          <w:i/>
+          <w:color w:val="6A6256"/>
+          <w:sz w:val="21"/>
+        </w:rPr>
+        <w:t>Right. Broad, vague laws like ‘vagrancy’ let officials arrest and convict Black Southerners almost at will — manufacturing the prisoners the system needed.</w:t>
+      </w:r>
+    </w:p>
+    <w:p>
+      <w:r>
+        <w:rPr>
+          <w:b/>
+          <w:color w:val="B1442F"/>
+          <w:sz w:val="22"/>
+        </w:rPr>
+        <w:t xml:space="preserve">QUESTION 3:  </w:t>
+      </w:r>
+      <w:r>
+        <w:rPr>
+          <w:sz w:val="22"/>
+        </w:rPr>
+        <w:t>Open response.</w:t>
+      </w:r>
+    </w:p>
+    <w:p>
+      <w:pPr>
+        <w:ind w:left="432"/>
+      </w:pPr>
+      <w:r>
+        <w:rPr>
+          <w:i/>
+          <w:color w:val="6A6256"/>
+          <w:sz w:val="21"/>
+        </w:rPr>
+        <w:t>Look for a response along the lines of: “The 13th Amendment's loophole led to…, which the Redeemers used to…, and the music of those prison farms shows…”</w:t>
+      </w:r>
+    </w:p>
+    <w:p>
+      <w:r>
+        <w:rPr>
+          <w:b/>
+          <w:color w:val="B1442F"/>
+          <w:sz w:val="22"/>
+        </w:rPr>
+        <w:t xml:space="preserve">QUESTION 4:  </w:t>
+      </w:r>
+      <w:r>
+        <w:rPr>
+          <w:sz w:val="22"/>
+        </w:rPr>
+        <w:t>Open response.</w:t>
+      </w:r>
+    </w:p>
+    <w:p>
+      <w:pPr>
+        <w:ind w:left="432"/>
+      </w:pPr>
+      <w:r>
+        <w:rPr>
+          <w:i/>
+          <w:color w:val="6A6256"/>
+          <w:sz w:val="21"/>
+        </w:rPr>
+        <w:t>Look for a response along the lines of: “The phrase ‘slavery by another name’ is ___ because…”</w:t>
+      </w:r>
+    </w:p>
     <w:sectPr>
       <w:pgSz w:w="12240" w:h="15840"/>
-      <w:pgMar w:top="1152" w:right="1152" w:bottom="1152" w:left="1152" w:header="720" w:footer="720" w:gutter="0"/>
+      <w:pgMar w:top="1008" w:right="1008" w:bottom="1008" w:left="1008" w:header="720" w:footer="720" w:gutter="0"/>
       <w:cols w:space="720"/>
       <w:docGrid w:linePitch="360"/>
     </w:sectPr>

</xml_diff>